<commit_message>
3.1.1-rasm namunasi: och fon, to‘q matn
Co-Authored-By: Claude Opus 5.5 <noreply@anthropic.com>
Claude-Session: https://claude.ai/code/session_01PxHTC8Q7yHdrpAeUA5KUgM
</commit_message>
<xml_diff>
--- a/Namuna_3.1.1-rasm.docx
+++ b/Namuna_3.1.1-rasm.docx
@@ -61,7 +61,7 @@
                             </a:avLst>
                           </a:prstGeom>
                           <a:solidFill>
-                            <a:srgbClr val="1F4E79"/>
+                            <a:srgbClr val="DEEAF6"/>
                           </a:solidFill>
                           <a:ln w="12700">
                             <a:solidFill>
@@ -79,7 +79,7 @@
                               <w:r>
                                 <w:rPr>
                                   <w:b/>
-                                  <w:color w:val="FFFFFF"/>
+                                  <w:color w:val="1F4E79"/>
                                   <w:sz w:val="20"/>
                                   <w:szCs w:val="20"/>
                                 </w:rPr>
@@ -94,7 +94,7 @@
                               <w:r>
                                 <w:rPr>
                                   <w:b/>
-                                  <w:color w:val="FFFFFF"/>
+                                  <w:color w:val="1F4E79"/>
                                   <w:sz w:val="20"/>
                                   <w:szCs w:val="20"/>
                                 </w:rPr>
@@ -109,7 +109,7 @@
                               <w:r>
                                 <w:rPr>
                                   <w:b/>
-                                  <w:color w:val="FFFFFF"/>
+                                  <w:color w:val="1F4E79"/>
                                   <w:sz w:val="20"/>
                                   <w:szCs w:val="20"/>
                                 </w:rPr>
@@ -136,11 +136,11 @@
                             </a:avLst>
                           </a:prstGeom>
                           <a:solidFill>
-                            <a:srgbClr val="EB6834"/>
+                            <a:srgbClr val="FBE5D6"/>
                           </a:solidFill>
                           <a:ln w="12700">
                             <a:solidFill>
-                              <a:srgbClr val="EB6834"/>
+                              <a:srgbClr val="A0400F"/>
                             </a:solidFill>
                           </a:ln>
                         </wps:spPr>
@@ -154,7 +154,7 @@
                               <w:r>
                                 <w:rPr>
                                   <w:b/>
-                                  <w:color w:val="FFFFFF"/>
+                                  <w:color w:val="A0400F"/>
                                   <w:sz w:val="20"/>
                                   <w:szCs w:val="20"/>
                                 </w:rPr>
@@ -169,7 +169,7 @@
                               <w:r>
                                 <w:rPr>
                                   <w:b/>
-                                  <w:color w:val="FFFFFF"/>
+                                  <w:color w:val="A0400F"/>
                                   <w:sz w:val="20"/>
                                   <w:szCs w:val="20"/>
                                 </w:rPr>
@@ -184,7 +184,7 @@
                               <w:r>
                                 <w:rPr>
                                   <w:b/>
-                                  <w:color w:val="FFFFFF"/>
+                                  <w:color w:val="A0400F"/>
                                   <w:sz w:val="20"/>
                                   <w:szCs w:val="20"/>
                                 </w:rPr>
@@ -211,11 +211,11 @@
                             </a:avLst>
                           </a:prstGeom>
                           <a:solidFill>
-                            <a:srgbClr val="2A78D6"/>
+                            <a:srgbClr val="DDEBF7"/>
                           </a:solidFill>
                           <a:ln w="12700">
                             <a:solidFill>
-                              <a:srgbClr val="2A78D6"/>
+                              <a:srgbClr val="1A4F8F"/>
                             </a:solidFill>
                           </a:ln>
                         </wps:spPr>
@@ -229,7 +229,7 @@
                               <w:r>
                                 <w:rPr>
                                   <w:b/>
-                                  <w:color w:val="FFFFFF"/>
+                                  <w:color w:val="1A4F8F"/>
                                   <w:sz w:val="20"/>
                                   <w:szCs w:val="20"/>
                                 </w:rPr>
@@ -244,7 +244,7 @@
                               <w:r>
                                 <w:rPr>
                                   <w:b/>
-                                  <w:color w:val="FFFFFF"/>
+                                  <w:color w:val="1A4F8F"/>
                                   <w:sz w:val="20"/>
                                   <w:szCs w:val="20"/>
                                 </w:rPr>
@@ -271,11 +271,11 @@
                             </a:avLst>
                           </a:prstGeom>
                           <a:solidFill>
-                            <a:srgbClr val="2A78D6"/>
+                            <a:srgbClr val="DDEBF7"/>
                           </a:solidFill>
                           <a:ln w="12700">
                             <a:solidFill>
-                              <a:srgbClr val="2A78D6"/>
+                              <a:srgbClr val="1A4F8F"/>
                             </a:solidFill>
                           </a:ln>
                         </wps:spPr>
@@ -289,7 +289,7 @@
                               <w:r>
                                 <w:rPr>
                                   <w:b/>
-                                  <w:color w:val="FFFFFF"/>
+                                  <w:color w:val="1A4F8F"/>
                                   <w:sz w:val="20"/>
                                   <w:szCs w:val="20"/>
                                 </w:rPr>
@@ -304,7 +304,7 @@
                               <w:r>
                                 <w:rPr>
                                   <w:b/>
-                                  <w:color w:val="FFFFFF"/>
+                                  <w:color w:val="1A4F8F"/>
                                   <w:sz w:val="20"/>
                                   <w:szCs w:val="20"/>
                                 </w:rPr>
@@ -319,7 +319,7 @@
                               <w:r>
                                 <w:rPr>
                                   <w:b/>
-                                  <w:color w:val="FFFFFF"/>
+                                  <w:color w:val="1A4F8F"/>
                                   <w:sz w:val="20"/>
                                   <w:szCs w:val="20"/>
                                 </w:rPr>
@@ -346,11 +346,11 @@
                             </a:avLst>
                           </a:prstGeom>
                           <a:solidFill>
-                            <a:srgbClr val="70AD47"/>
+                            <a:srgbClr val="E2F0D9"/>
                           </a:solidFill>
                           <a:ln w="12700">
                             <a:solidFill>
-                              <a:srgbClr val="70AD47"/>
+                              <a:srgbClr val="375623"/>
                             </a:solidFill>
                           </a:ln>
                         </wps:spPr>
@@ -364,7 +364,7 @@
                               <w:r>
                                 <w:rPr>
                                   <w:b/>
-                                  <w:color w:val="FFFFFF"/>
+                                  <w:color w:val="375623"/>
                                   <w:sz w:val="20"/>
                                   <w:szCs w:val="20"/>
                                 </w:rPr>
@@ -379,7 +379,7 @@
                               <w:r>
                                 <w:rPr>
                                   <w:b/>
-                                  <w:color w:val="FFFFFF"/>
+                                  <w:color w:val="375623"/>
                                   <w:sz w:val="20"/>
                                   <w:szCs w:val="20"/>
                                 </w:rPr>
@@ -406,11 +406,11 @@
                             </a:avLst>
                           </a:prstGeom>
                           <a:solidFill>
-                            <a:srgbClr val="70AD47"/>
+                            <a:srgbClr val="E2F0D9"/>
                           </a:solidFill>
                           <a:ln w="12700">
                             <a:solidFill>
-                              <a:srgbClr val="70AD47"/>
+                              <a:srgbClr val="375623"/>
                             </a:solidFill>
                           </a:ln>
                         </wps:spPr>
@@ -424,7 +424,7 @@
                               <w:r>
                                 <w:rPr>
                                   <w:b/>
-                                  <w:color w:val="FFFFFF"/>
+                                  <w:color w:val="375623"/>
                                   <w:sz w:val="20"/>
                                   <w:szCs w:val="20"/>
                                 </w:rPr>
@@ -439,7 +439,7 @@
                               <w:r>
                                 <w:rPr>
                                   <w:b/>
-                                  <w:color w:val="FFFFFF"/>
+                                  <w:color w:val="375623"/>
                                   <w:sz w:val="20"/>
                                   <w:szCs w:val="20"/>
                                 </w:rPr>
@@ -454,7 +454,7 @@
                               <w:r>
                                 <w:rPr>
                                   <w:b/>
-                                  <w:color w:val="FFFFFF"/>
+                                  <w:color w:val="375623"/>
                                   <w:sz w:val="20"/>
                                   <w:szCs w:val="20"/>
                                 </w:rPr>
@@ -469,7 +469,7 @@
                               <w:r>
                                 <w:rPr>
                                   <w:b/>
-                                  <w:color w:val="FFFFFF"/>
+                                  <w:color w:val="375623"/>
                                   <w:sz w:val="20"/>
                                   <w:szCs w:val="20"/>
                                 </w:rPr>
@@ -496,11 +496,11 @@
                             </a:avLst>
                           </a:prstGeom>
                           <a:solidFill>
-                            <a:srgbClr val="7030A0"/>
+                            <a:srgbClr val="E9E1F2"/>
                           </a:solidFill>
                           <a:ln w="12700">
                             <a:solidFill>
-                              <a:srgbClr val="7030A0"/>
+                              <a:srgbClr val="4B1F6F"/>
                             </a:solidFill>
                           </a:ln>
                         </wps:spPr>
@@ -514,7 +514,7 @@
                               <w:r>
                                 <w:rPr>
                                   <w:b/>
-                                  <w:color w:val="FFFFFF"/>
+                                  <w:color w:val="4B1F6F"/>
                                   <w:sz w:val="20"/>
                                   <w:szCs w:val="20"/>
                                 </w:rPr>
@@ -529,7 +529,7 @@
                               <w:r>
                                 <w:rPr>
                                   <w:b/>
-                                  <w:color w:val="FFFFFF"/>
+                                  <w:color w:val="4B1F6F"/>
                                   <w:sz w:val="20"/>
                                   <w:szCs w:val="20"/>
                                 </w:rPr>
@@ -544,7 +544,7 @@
                               <w:r>
                                 <w:rPr>
                                   <w:b/>
-                                  <w:color w:val="FFFFFF"/>
+                                  <w:color w:val="4B1F6F"/>
                                   <w:sz w:val="20"/>
                                   <w:szCs w:val="20"/>
                                 </w:rPr>
@@ -571,11 +571,11 @@
                             </a:avLst>
                           </a:prstGeom>
                           <a:solidFill>
-                            <a:srgbClr val="C00000"/>
+                            <a:srgbClr val="F8D9D9"/>
                           </a:solidFill>
                           <a:ln w="12700">
                             <a:solidFill>
-                              <a:srgbClr val="C00000"/>
+                              <a:srgbClr val="8B0000"/>
                             </a:solidFill>
                           </a:ln>
                         </wps:spPr>
@@ -589,7 +589,7 @@
                               <w:r>
                                 <w:rPr>
                                   <w:b/>
-                                  <w:color w:val="FFFFFF"/>
+                                  <w:color w:val="8B0000"/>
                                   <w:sz w:val="20"/>
                                   <w:szCs w:val="20"/>
                                 </w:rPr>
@@ -604,7 +604,7 @@
                               <w:r>
                                 <w:rPr>
                                   <w:b/>
-                                  <w:color w:val="FFFFFF"/>
+                                  <w:color w:val="8B0000"/>
                                   <w:sz w:val="20"/>
                                   <w:szCs w:val="20"/>
                                 </w:rPr>
@@ -619,7 +619,7 @@
                               <w:r>
                                 <w:rPr>
                                   <w:b/>
-                                  <w:color w:val="FFFFFF"/>
+                                  <w:color w:val="8B0000"/>
                                   <w:sz w:val="20"/>
                                   <w:szCs w:val="20"/>
                                 </w:rPr>
@@ -781,7 +781,7 @@
           <mc:Fallback>
             <w:pict>
               <v:group w14:anchorId="1EABDA6D" id="3.1.1-rasm" o:spid="_x0000_s1306" style="width:467.7pt;height:153.05pt;mso-position-horizontal-relative:char;mso-position-vertical-relative:line" coordsize="59400,19440" o:gfxdata="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">
-                <v:roundrect id="Shape 2" o:spid="_x0000_s1307" style="position:absolute;left:360;top:720;width:12960;height:7200;visibility:visible;mso-wrap-style:square;v-text-anchor:middle" arcsize="6554f" o:gfxdata="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" fillcolor="#1f4e79" strokecolor="#1f4e79" strokeweight="1pt">
+                <v:roundrect id="Shape 2" o:spid="_x0000_s1307" style="position:absolute;left:360;top:720;width:12960;height:7200;visibility:visible;mso-wrap-style:square;v-text-anchor:middle" arcsize="6554f" o:gfxdata="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" fillcolor="#DEEAF6" strokecolor="#1F4E79" strokeweight="1pt">
                   <v:textbox inset="1mm,.5mm,1mm,.5mm">
                     <w:txbxContent>
                       <w:p>
@@ -792,7 +792,7 @@
                         <w:r>
                           <w:rPr>
                             <w:b/>
-                            <w:color w:val="FFFFFF"/>
+                            <w:color w:val="1F4E79"/>
                             <w:sz w:val="20"/>
                             <w:szCs w:val="20"/>
                           </w:rPr>
@@ -807,7 +807,7 @@
                         <w:r>
                           <w:rPr>
                             <w:b/>
-                            <w:color w:val="FFFFFF"/>
+                            <w:color w:val="1F4E79"/>
                             <w:sz w:val="20"/>
                             <w:szCs w:val="20"/>
                           </w:rPr>
@@ -822,7 +822,7 @@
                         <w:r>
                           <w:rPr>
                             <w:b/>
-                            <w:color w:val="FFFFFF"/>
+                            <w:color w:val="1F4E79"/>
                             <w:sz w:val="20"/>
                             <w:szCs w:val="20"/>
                           </w:rPr>
@@ -832,7 +832,7 @@
                     </w:txbxContent>
                   </v:textbox>
                 </v:roundrect>
-                <v:roundrect id="Shape 3" o:spid="_x0000_s1308" style="position:absolute;left:15480;top:720;width:12960;height:7200;visibility:visible;mso-wrap-style:square;v-text-anchor:middle" arcsize="6554f" o:gfxdata="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" fillcolor="#eb6834" strokecolor="#eb6834" strokeweight="1pt">
+                <v:roundrect id="Shape 3" o:spid="_x0000_s1308" style="position:absolute;left:15480;top:720;width:12960;height:7200;visibility:visible;mso-wrap-style:square;v-text-anchor:middle" arcsize="6554f" o:gfxdata="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" fillcolor="#FBE5D6" strokecolor="#A0400F" strokeweight="1pt">
                   <v:textbox inset="1mm,.5mm,1mm,.5mm">
                     <w:txbxContent>
                       <w:p>
@@ -843,7 +843,7 @@
                         <w:r>
                           <w:rPr>
                             <w:b/>
-                            <w:color w:val="FFFFFF"/>
+                            <w:color w:val="A0400F"/>
                             <w:sz w:val="20"/>
                             <w:szCs w:val="20"/>
                           </w:rPr>
@@ -858,7 +858,7 @@
                         <w:r>
                           <w:rPr>
                             <w:b/>
-                            <w:color w:val="FFFFFF"/>
+                            <w:color w:val="A0400F"/>
                             <w:sz w:val="20"/>
                             <w:szCs w:val="20"/>
                           </w:rPr>
@@ -873,7 +873,7 @@
                         <w:r>
                           <w:rPr>
                             <w:b/>
-                            <w:color w:val="FFFFFF"/>
+                            <w:color w:val="A0400F"/>
                             <w:sz w:val="20"/>
                             <w:szCs w:val="20"/>
                           </w:rPr>
@@ -883,7 +883,7 @@
                     </w:txbxContent>
                   </v:textbox>
                 </v:roundrect>
-                <v:roundrect id="Shape 4" o:spid="_x0000_s1309" style="position:absolute;left:30600;top:720;width:12960;height:7200;visibility:visible;mso-wrap-style:square;v-text-anchor:middle" arcsize="6554f" o:gfxdata="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" fillcolor="#2a78d6" strokecolor="#2a78d6" strokeweight="1pt">
+                <v:roundrect id="Shape 4" o:spid="_x0000_s1309" style="position:absolute;left:30600;top:720;width:12960;height:7200;visibility:visible;mso-wrap-style:square;v-text-anchor:middle" arcsize="6554f" o:gfxdata="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" fillcolor="#DDEBF7" strokecolor="#1A4F8F" strokeweight="1pt">
                   <v:textbox inset="1mm,.5mm,1mm,.5mm">
                     <w:txbxContent>
                       <w:p>
@@ -894,7 +894,7 @@
                         <w:r>
                           <w:rPr>
                             <w:b/>
-                            <w:color w:val="FFFFFF"/>
+                            <w:color w:val="1A4F8F"/>
                             <w:sz w:val="20"/>
                             <w:szCs w:val="20"/>
                           </w:rPr>
@@ -909,7 +909,7 @@
                         <w:r>
                           <w:rPr>
                             <w:b/>
-                            <w:color w:val="FFFFFF"/>
+                            <w:color w:val="1A4F8F"/>
                             <w:sz w:val="20"/>
                             <w:szCs w:val="20"/>
                           </w:rPr>
@@ -919,7 +919,7 @@
                     </w:txbxContent>
                   </v:textbox>
                 </v:roundrect>
-                <v:roundrect id="Shape 5" o:spid="_x0000_s1310" style="position:absolute;left:45720;top:720;width:12960;height:7200;visibility:visible;mso-wrap-style:square;v-text-anchor:middle" arcsize="6554f" o:gfxdata="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" fillcolor="#2a78d6" strokecolor="#2a78d6" strokeweight="1pt">
+                <v:roundrect id="Shape 5" o:spid="_x0000_s1310" style="position:absolute;left:45720;top:720;width:12960;height:7200;visibility:visible;mso-wrap-style:square;v-text-anchor:middle" arcsize="6554f" o:gfxdata="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" fillcolor="#DDEBF7" strokecolor="#1A4F8F" strokeweight="1pt">
                   <v:textbox inset="1mm,.5mm,1mm,.5mm">
                     <w:txbxContent>
                       <w:p>
@@ -930,7 +930,7 @@
                         <w:r>
                           <w:rPr>
                             <w:b/>
-                            <w:color w:val="FFFFFF"/>
+                            <w:color w:val="1A4F8F"/>
                             <w:sz w:val="20"/>
                             <w:szCs w:val="20"/>
                           </w:rPr>
@@ -945,7 +945,7 @@
                         <w:r>
                           <w:rPr>
                             <w:b/>
-                            <w:color w:val="FFFFFF"/>
+                            <w:color w:val="1A4F8F"/>
                             <w:sz w:val="20"/>
                             <w:szCs w:val="20"/>
                           </w:rPr>
@@ -960,7 +960,7 @@
                         <w:r>
                           <w:rPr>
                             <w:b/>
-                            <w:color w:val="FFFFFF"/>
+                            <w:color w:val="1A4F8F"/>
                             <w:sz w:val="20"/>
                             <w:szCs w:val="20"/>
                           </w:rPr>
@@ -970,7 +970,7 @@
                     </w:txbxContent>
                   </v:textbox>
                 </v:roundrect>
-                <v:roundrect id="Shape 6" o:spid="_x0000_s1311" style="position:absolute;left:45720;top:11520;width:12960;height:7200;visibility:visible;mso-wrap-style:square;v-text-anchor:middle" arcsize="6554f" o:gfxdata="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" fillcolor="#70ad47" strokecolor="#70ad47" strokeweight="1pt">
+                <v:roundrect id="Shape 6" o:spid="_x0000_s1311" style="position:absolute;left:45720;top:11520;width:12960;height:7200;visibility:visible;mso-wrap-style:square;v-text-anchor:middle" arcsize="6554f" o:gfxdata="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" fillcolor="#E2F0D9" strokecolor="#375623" strokeweight="1pt">
                   <v:textbox inset="1mm,.5mm,1mm,.5mm">
                     <w:txbxContent>
                       <w:p>
@@ -981,7 +981,7 @@
                         <w:r>
                           <w:rPr>
                             <w:b/>
-                            <w:color w:val="FFFFFF"/>
+                            <w:color w:val="375623"/>
                             <w:sz w:val="20"/>
                             <w:szCs w:val="20"/>
                           </w:rPr>
@@ -996,7 +996,7 @@
                         <w:r>
                           <w:rPr>
                             <w:b/>
-                            <w:color w:val="FFFFFF"/>
+                            <w:color w:val="375623"/>
                             <w:sz w:val="20"/>
                             <w:szCs w:val="20"/>
                           </w:rPr>
@@ -1006,7 +1006,7 @@
                     </w:txbxContent>
                   </v:textbox>
                 </v:roundrect>
-                <v:roundrect id="Shape 7" o:spid="_x0000_s1312" style="position:absolute;left:30600;top:11520;width:12960;height:7200;visibility:visible;mso-wrap-style:square;v-text-anchor:middle" arcsize="6554f" o:gfxdata="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" fillcolor="#70ad47" strokecolor="#70ad47" strokeweight="1pt">
+                <v:roundrect id="Shape 7" o:spid="_x0000_s1312" style="position:absolute;left:30600;top:11520;width:12960;height:7200;visibility:visible;mso-wrap-style:square;v-text-anchor:middle" arcsize="6554f" o:gfxdata="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" fillcolor="#E2F0D9" strokecolor="#375623" strokeweight="1pt">
                   <v:textbox inset="1mm,.5mm,1mm,.5mm">
                     <w:txbxContent>
                       <w:p>
@@ -1017,7 +1017,7 @@
                         <w:r>
                           <w:rPr>
                             <w:b/>
-                            <w:color w:val="FFFFFF"/>
+                            <w:color w:val="375623"/>
                             <w:sz w:val="20"/>
                             <w:szCs w:val="20"/>
                           </w:rPr>
@@ -1032,7 +1032,7 @@
                         <w:r>
                           <w:rPr>
                             <w:b/>
-                            <w:color w:val="FFFFFF"/>
+                            <w:color w:val="375623"/>
                             <w:sz w:val="20"/>
                             <w:szCs w:val="20"/>
                           </w:rPr>
@@ -1047,7 +1047,7 @@
                         <w:r>
                           <w:rPr>
                             <w:b/>
-                            <w:color w:val="FFFFFF"/>
+                            <w:color w:val="375623"/>
                             <w:sz w:val="20"/>
                             <w:szCs w:val="20"/>
                           </w:rPr>
@@ -1062,7 +1062,7 @@
                         <w:r>
                           <w:rPr>
                             <w:b/>
-                            <w:color w:val="FFFFFF"/>
+                            <w:color w:val="375623"/>
                             <w:sz w:val="20"/>
                             <w:szCs w:val="20"/>
                           </w:rPr>
@@ -1072,7 +1072,7 @@
                     </w:txbxContent>
                   </v:textbox>
                 </v:roundrect>
-                <v:roundrect id="Shape 8" o:spid="_x0000_s1313" style="position:absolute;left:15480;top:11520;width:12960;height:7200;visibility:visible;mso-wrap-style:square;v-text-anchor:middle" arcsize="6554f" o:gfxdata="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" fillcolor="#7030a0" strokecolor="#7030a0" strokeweight="1pt">
+                <v:roundrect id="Shape 8" o:spid="_x0000_s1313" style="position:absolute;left:15480;top:11520;width:12960;height:7200;visibility:visible;mso-wrap-style:square;v-text-anchor:middle" arcsize="6554f" o:gfxdata="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" fillcolor="#E9E1F2" strokecolor="#4B1F6F" strokeweight="1pt">
                   <v:textbox inset="1mm,.5mm,1mm,.5mm">
                     <w:txbxContent>
                       <w:p>
@@ -1083,7 +1083,7 @@
                         <w:r>
                           <w:rPr>
                             <w:b/>
-                            <w:color w:val="FFFFFF"/>
+                            <w:color w:val="4B1F6F"/>
                             <w:sz w:val="20"/>
                             <w:szCs w:val="20"/>
                           </w:rPr>
@@ -1098,7 +1098,7 @@
                         <w:r>
                           <w:rPr>
                             <w:b/>
-                            <w:color w:val="FFFFFF"/>
+                            <w:color w:val="4B1F6F"/>
                             <w:sz w:val="20"/>
                             <w:szCs w:val="20"/>
                           </w:rPr>
@@ -1113,7 +1113,7 @@
                         <w:r>
                           <w:rPr>
                             <w:b/>
-                            <w:color w:val="FFFFFF"/>
+                            <w:color w:val="4B1F6F"/>
                             <w:sz w:val="20"/>
                             <w:szCs w:val="20"/>
                           </w:rPr>
@@ -1123,7 +1123,7 @@
                     </w:txbxContent>
                   </v:textbox>
                 </v:roundrect>
-                <v:roundrect id="Shape 9" o:spid="_x0000_s1314" style="position:absolute;left:360;top:11520;width:12960;height:7200;visibility:visible;mso-wrap-style:square;v-text-anchor:middle" arcsize="6554f" o:gfxdata="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" fillcolor="#c00000" strokecolor="#c00000" strokeweight="1pt">
+                <v:roundrect id="Shape 9" o:spid="_x0000_s1314" style="position:absolute;left:360;top:11520;width:12960;height:7200;visibility:visible;mso-wrap-style:square;v-text-anchor:middle" arcsize="6554f" o:gfxdata="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" fillcolor="#F8D9D9" strokecolor="#8B0000" strokeweight="1pt">
                   <v:textbox inset="1mm,.5mm,1mm,.5mm">
                     <w:txbxContent>
                       <w:p>
@@ -1134,7 +1134,7 @@
                         <w:r>
                           <w:rPr>
                             <w:b/>
-                            <w:color w:val="FFFFFF"/>
+                            <w:color w:val="8B0000"/>
                             <w:sz w:val="20"/>
                             <w:szCs w:val="20"/>
                           </w:rPr>
@@ -1149,7 +1149,7 @@
                         <w:r>
                           <w:rPr>
                             <w:b/>
-                            <w:color w:val="FFFFFF"/>
+                            <w:color w:val="8B0000"/>
                             <w:sz w:val="20"/>
                             <w:szCs w:val="20"/>
                           </w:rPr>
@@ -1164,7 +1164,7 @@
                         <w:r>
                           <w:rPr>
                             <w:b/>
-                            <w:color w:val="FFFFFF"/>
+                            <w:color w:val="8B0000"/>
                             <w:sz w:val="20"/>
                             <w:szCs w:val="20"/>
                           </w:rPr>

</xml_diff>